<commit_message>
Adjust item 8 handling and regenerate outputs
Commented-out code in Fit_3PL_Fix_3EM_MT_S1.R that removed rpa_008/Item rpa_008 so the item is no longer automatically excluded. Updated gera_relatorio_3EM_MT.py to reflect that item 8 from Simulado I was retained in the TRI with a technical caveat: changed lead text, the item table entry, risk paragraph, and recommendations. Also improved parameter-summary formatting (compute counts once and handle singular/plural). Regenerated binary report artifacts (docx, xlsx, pdf) in Relatorios and ResultadosTRI/Simulado_I to reflect these changes.
</commit_message>
<xml_diff>
--- a/Piaui/2026/Relatorios/3EM_MT/Relatorio_Tecnico_3EM_MT_TCM_TRI_refinado.docx
+++ b/Piaui/2026/Relatorios/3EM_MT/Relatorio_Tecnico_3EM_MT_TCM_TRI_refinado.docx
@@ -142,7 +142,7 @@
           <w:color w:val="5F6B76"/>
           <w:sz w:val="20"/>
         </w:rPr>
-        <w:t>20 de junho de 2026</w:t>
+        <w:t>22 de junho de 2026</w:t>
       </w:r>
     </w:p>
     <w:p>
@@ -161,7 +161,6 @@
       <w:pPr>
         <w:pStyle w:val="Heading1"/>
         <w:spacing w:before="0" w:after="160"/>
-        <w:jc w:val="both"/>
         <w:rPr/>
       </w:pPr>
       <w:r>
@@ -177,7 +176,6 @@
         </w:pBdr>
         <w:shd w:fill="EDF4FB"/>
         <w:spacing w:before="80" w:after="200"/>
-        <w:jc w:val="both"/>
         <w:rPr/>
       </w:pPr>
       <w:r>
@@ -186,7 +184,7 @@
           <w:color w:val="203748"/>
           <w:sz w:val="21"/>
         </w:rPr>
-        <w:t>Leitura principal. As duas aplicações apresentaram provas exigentes para a população avaliada. No Simulado I, o item 8 mostrou discriminação praticamente nula; no Simulado II, o mesmo ocorreu com o item 14. Ambos foram excluídos da calibração TRI, em coerência com os indícios de conflito de gabarito registrados pela equipe.</w:t>
+        <w:t>Leitura principal. As duas aplicações apresentaram provas exigentes para a população avaliada. No Simulado I, o item 8 mostrou discriminação praticamente nula; no Simulado II, o mesmo ocorreu com o item 14. O item 8 foi mantido na nova calibração TRI, apesar da ressalva; o item 14 permaneceu excluído, em coerência com os indícios de conflito de gabarito.</w:t>
       </w:r>
     </w:p>
     <w:tbl>
@@ -230,7 +228,7 @@
               <w:pStyle w:val="Normal"/>
               <w:widowControl/>
               <w:spacing w:before="0" w:after="0"/>
-              <w:jc w:val="both"/>
+              <w:jc w:val="center"/>
               <w:rPr>
                 <w:rFonts w:eastAsia="ＭＳ 明朝" w:cs=""/>
                 <w:kern w:val="0"/>
@@ -264,7 +262,7 @@
               <w:pStyle w:val="Normal"/>
               <w:widowControl/>
               <w:spacing w:before="0" w:after="0"/>
-              <w:jc w:val="both"/>
+              <w:jc w:val="center"/>
               <w:rPr>
                 <w:rFonts w:eastAsia="ＭＳ 明朝" w:cs=""/>
                 <w:kern w:val="0"/>
@@ -298,7 +296,7 @@
               <w:pStyle w:val="Normal"/>
               <w:widowControl/>
               <w:spacing w:before="0" w:after="0"/>
-              <w:jc w:val="both"/>
+              <w:jc w:val="center"/>
               <w:rPr>
                 <w:rFonts w:eastAsia="ＭＳ 明朝" w:cs=""/>
                 <w:kern w:val="0"/>
@@ -332,7 +330,7 @@
               <w:pStyle w:val="Normal"/>
               <w:widowControl/>
               <w:spacing w:before="0" w:after="0"/>
-              <w:jc w:val="both"/>
+              <w:jc w:val="center"/>
               <w:rPr>
                 <w:rFonts w:eastAsia="ＭＳ 明朝" w:cs=""/>
                 <w:kern w:val="0"/>
@@ -366,7 +364,7 @@
               <w:pStyle w:val="Normal"/>
               <w:widowControl/>
               <w:spacing w:before="0" w:after="0"/>
-              <w:jc w:val="both"/>
+              <w:jc w:val="center"/>
               <w:rPr>
                 <w:rFonts w:eastAsia="ＭＳ 明朝" w:cs=""/>
                 <w:kern w:val="0"/>
@@ -400,7 +398,7 @@
               <w:pStyle w:val="Normal"/>
               <w:widowControl/>
               <w:spacing w:before="0" w:after="0"/>
-              <w:jc w:val="both"/>
+              <w:jc w:val="center"/>
               <w:rPr>
                 <w:rFonts w:eastAsia="ＭＳ 明朝" w:cs=""/>
                 <w:kern w:val="0"/>
@@ -434,7 +432,7 @@
               <w:pStyle w:val="Normal"/>
               <w:widowControl/>
               <w:spacing w:before="0" w:after="0"/>
-              <w:jc w:val="both"/>
+              <w:jc w:val="center"/>
               <w:rPr>
                 <w:rFonts w:eastAsia="ＭＳ 明朝" w:cs=""/>
                 <w:kern w:val="0"/>
@@ -472,7 +470,7 @@
               <w:pStyle w:val="Normal"/>
               <w:widowControl/>
               <w:spacing w:before="0" w:after="0"/>
-              <w:jc w:val="both"/>
+              <w:jc w:val="left"/>
               <w:rPr>
                 <w:rFonts w:eastAsia="ＭＳ 明朝" w:cs=""/>
                 <w:kern w:val="0"/>
@@ -504,7 +502,7 @@
               <w:pStyle w:val="Normal"/>
               <w:widowControl/>
               <w:spacing w:before="0" w:after="0"/>
-              <w:jc w:val="both"/>
+              <w:jc w:val="center"/>
               <w:rPr>
                 <w:rFonts w:eastAsia="ＭＳ 明朝" w:cs=""/>
                 <w:kern w:val="0"/>
@@ -536,24 +534,24 @@
               <w:pStyle w:val="Normal"/>
               <w:widowControl/>
               <w:spacing w:before="0" w:after="0"/>
-              <w:jc w:val="both"/>
-              <w:rPr>
-                <w:rFonts w:eastAsia="ＭＳ 明朝" w:cs=""/>
-                <w:kern w:val="0"/>
-                <w:szCs w:val="22"/>
-                <w:lang w:val="en-US" w:eastAsia="en-US" w:bidi="ar-SA"/>
-              </w:rPr>
-            </w:pPr>
-            <w:r>
-              <w:rPr>
-                <w:rFonts w:eastAsia="ＭＳ 明朝" w:cs=""/>
-                <w:color w:val="222222"/>
-                <w:kern w:val="0"/>
-                <w:sz w:val="18"/>
-                <w:szCs w:val="22"/>
-                <w:lang w:val="en-US" w:eastAsia="en-US" w:bidi="ar-SA"/>
-              </w:rPr>
-              <w:t>26 / 25</w:t>
+              <w:jc w:val="center"/>
+              <w:rPr>
+                <w:rFonts w:eastAsia="ＭＳ 明朝" w:cs=""/>
+                <w:kern w:val="0"/>
+                <w:szCs w:val="22"/>
+                <w:lang w:val="en-US" w:eastAsia="en-US" w:bidi="ar-SA"/>
+              </w:rPr>
+            </w:pPr>
+            <w:r>
+              <w:rPr>
+                <w:rFonts w:eastAsia="ＭＳ 明朝" w:cs=""/>
+                <w:color w:val="222222"/>
+                <w:kern w:val="0"/>
+                <w:sz w:val="18"/>
+                <w:szCs w:val="22"/>
+                <w:lang w:val="en-US" w:eastAsia="en-US" w:bidi="ar-SA"/>
+              </w:rPr>
+              <w:t>26 / 26</w:t>
             </w:r>
           </w:p>
         </w:tc>
@@ -568,7 +566,7 @@
               <w:pStyle w:val="Normal"/>
               <w:widowControl/>
               <w:spacing w:before="0" w:after="0"/>
-              <w:jc w:val="both"/>
+              <w:jc w:val="center"/>
               <w:rPr>
                 <w:rFonts w:eastAsia="ＭＳ 明朝" w:cs=""/>
                 <w:kern w:val="0"/>
@@ -600,7 +598,7 @@
               <w:pStyle w:val="Normal"/>
               <w:widowControl/>
               <w:spacing w:before="0" w:after="0"/>
-              <w:jc w:val="both"/>
+              <w:jc w:val="center"/>
               <w:rPr>
                 <w:rFonts w:eastAsia="ＭＳ 明朝" w:cs=""/>
                 <w:kern w:val="0"/>
@@ -632,24 +630,24 @@
               <w:pStyle w:val="Normal"/>
               <w:widowControl/>
               <w:spacing w:before="0" w:after="0"/>
-              <w:jc w:val="both"/>
-              <w:rPr>
-                <w:rFonts w:eastAsia="ＭＳ 明朝" w:cs=""/>
-                <w:kern w:val="0"/>
-                <w:szCs w:val="22"/>
-                <w:lang w:val="en-US" w:eastAsia="en-US" w:bidi="ar-SA"/>
-              </w:rPr>
-            </w:pPr>
-            <w:r>
-              <w:rPr>
-                <w:rFonts w:eastAsia="ＭＳ 明朝" w:cs=""/>
-                <w:color w:val="222222"/>
-                <w:kern w:val="0"/>
-                <w:sz w:val="18"/>
-                <w:szCs w:val="22"/>
-                <w:lang w:val="en-US" w:eastAsia="en-US" w:bidi="ar-SA"/>
-              </w:rPr>
-              <w:t>289,8</w:t>
+              <w:jc w:val="center"/>
+              <w:rPr>
+                <w:rFonts w:eastAsia="ＭＳ 明朝" w:cs=""/>
+                <w:kern w:val="0"/>
+                <w:szCs w:val="22"/>
+                <w:lang w:val="en-US" w:eastAsia="en-US" w:bidi="ar-SA"/>
+              </w:rPr>
+            </w:pPr>
+            <w:r>
+              <w:rPr>
+                <w:rFonts w:eastAsia="ＭＳ 明朝" w:cs=""/>
+                <w:color w:val="222222"/>
+                <w:kern w:val="0"/>
+                <w:sz w:val="18"/>
+                <w:szCs w:val="22"/>
+                <w:lang w:val="en-US" w:eastAsia="en-US" w:bidi="ar-SA"/>
+              </w:rPr>
+              <w:t>280,4</w:t>
             </w:r>
           </w:p>
         </w:tc>
@@ -664,24 +662,24 @@
               <w:pStyle w:val="Normal"/>
               <w:widowControl/>
               <w:spacing w:before="0" w:after="0"/>
-              <w:jc w:val="both"/>
-              <w:rPr>
-                <w:rFonts w:eastAsia="ＭＳ 明朝" w:cs=""/>
-                <w:kern w:val="0"/>
-                <w:szCs w:val="22"/>
-                <w:lang w:val="en-US" w:eastAsia="en-US" w:bidi="ar-SA"/>
-              </w:rPr>
-            </w:pPr>
-            <w:r>
-              <w:rPr>
-                <w:rFonts w:eastAsia="ＭＳ 明朝" w:cs=""/>
-                <w:color w:val="222222"/>
-                <w:kern w:val="0"/>
-                <w:sz w:val="18"/>
-                <w:szCs w:val="22"/>
-                <w:lang w:val="en-US" w:eastAsia="en-US" w:bidi="ar-SA"/>
-              </w:rPr>
-              <w:t>Item 8</w:t>
+              <w:jc w:val="center"/>
+              <w:rPr>
+                <w:rFonts w:eastAsia="ＭＳ 明朝" w:cs=""/>
+                <w:kern w:val="0"/>
+                <w:szCs w:val="22"/>
+                <w:lang w:val="en-US" w:eastAsia="en-US" w:bidi="ar-SA"/>
+              </w:rPr>
+            </w:pPr>
+            <w:r>
+              <w:rPr>
+                <w:rFonts w:eastAsia="ＭＳ 明朝" w:cs=""/>
+                <w:color w:val="222222"/>
+                <w:kern w:val="0"/>
+                <w:sz w:val="18"/>
+                <w:szCs w:val="22"/>
+                <w:lang w:val="en-US" w:eastAsia="en-US" w:bidi="ar-SA"/>
+              </w:rPr>
+              <w:t>Nenhum</w:t>
             </w:r>
           </w:p>
         </w:tc>
@@ -701,7 +699,7 @@
               <w:pStyle w:val="Normal"/>
               <w:widowControl/>
               <w:spacing w:before="0" w:after="0"/>
-              <w:jc w:val="both"/>
+              <w:jc w:val="left"/>
               <w:rPr>
                 <w:rFonts w:eastAsia="ＭＳ 明朝" w:cs=""/>
                 <w:kern w:val="0"/>
@@ -733,7 +731,7 @@
               <w:pStyle w:val="Normal"/>
               <w:widowControl/>
               <w:spacing w:before="0" w:after="0"/>
-              <w:jc w:val="both"/>
+              <w:jc w:val="center"/>
               <w:rPr>
                 <w:rFonts w:eastAsia="ＭＳ 明朝" w:cs=""/>
                 <w:kern w:val="0"/>
@@ -765,7 +763,7 @@
               <w:pStyle w:val="Normal"/>
               <w:widowControl/>
               <w:spacing w:before="0" w:after="0"/>
-              <w:jc w:val="both"/>
+              <w:jc w:val="center"/>
               <w:rPr>
                 <w:rFonts w:eastAsia="ＭＳ 明朝" w:cs=""/>
                 <w:kern w:val="0"/>
@@ -797,7 +795,7 @@
               <w:pStyle w:val="Normal"/>
               <w:widowControl/>
               <w:spacing w:before="0" w:after="0"/>
-              <w:jc w:val="both"/>
+              <w:jc w:val="center"/>
               <w:rPr>
                 <w:rFonts w:eastAsia="ＭＳ 明朝" w:cs=""/>
                 <w:kern w:val="0"/>
@@ -829,7 +827,7 @@
               <w:pStyle w:val="Normal"/>
               <w:widowControl/>
               <w:spacing w:before="0" w:after="0"/>
-              <w:jc w:val="both"/>
+              <w:jc w:val="center"/>
               <w:rPr>
                 <w:rFonts w:eastAsia="ＭＳ 明朝" w:cs=""/>
                 <w:kern w:val="0"/>
@@ -861,7 +859,7 @@
               <w:pStyle w:val="Normal"/>
               <w:widowControl/>
               <w:spacing w:before="0" w:after="0"/>
-              <w:jc w:val="both"/>
+              <w:jc w:val="center"/>
               <w:rPr>
                 <w:rFonts w:eastAsia="ＭＳ 明朝" w:cs=""/>
                 <w:kern w:val="0"/>
@@ -893,24 +891,24 @@
               <w:pStyle w:val="Normal"/>
               <w:widowControl/>
               <w:spacing w:before="0" w:after="0"/>
-              <w:jc w:val="both"/>
-              <w:rPr>
-                <w:rFonts w:eastAsia="ＭＳ 明朝" w:cs=""/>
-                <w:kern w:val="0"/>
-                <w:szCs w:val="22"/>
-                <w:lang w:val="en-US" w:eastAsia="en-US" w:bidi="ar-SA"/>
-              </w:rPr>
-            </w:pPr>
-            <w:r>
-              <w:rPr>
-                <w:rFonts w:eastAsia="ＭＳ 明朝" w:cs=""/>
-                <w:color w:val="222222"/>
-                <w:kern w:val="0"/>
-                <w:sz w:val="18"/>
-                <w:szCs w:val="22"/>
-                <w:lang w:val="en-US" w:eastAsia="en-US" w:bidi="ar-SA"/>
-              </w:rPr>
-              <w:t>Item 14</w:t>
+              <w:jc w:val="center"/>
+              <w:rPr>
+                <w:rFonts w:eastAsia="ＭＳ 明朝" w:cs=""/>
+                <w:kern w:val="0"/>
+                <w:szCs w:val="22"/>
+                <w:lang w:val="en-US" w:eastAsia="en-US" w:bidi="ar-SA"/>
+              </w:rPr>
+            </w:pPr>
+            <w:r>
+              <w:rPr>
+                <w:rFonts w:eastAsia="ＭＳ 明朝" w:cs=""/>
+                <w:color w:val="222222"/>
+                <w:kern w:val="0"/>
+                <w:sz w:val="18"/>
+                <w:szCs w:val="22"/>
+                <w:lang w:val="en-US" w:eastAsia="en-US" w:bidi="ar-SA"/>
+              </w:rPr>
+              <w:t>14</w:t>
             </w:r>
           </w:p>
         </w:tc>
@@ -920,7 +918,6 @@
       <w:pPr>
         <w:pStyle w:val="Normal"/>
         <w:spacing w:before="80" w:after="80"/>
-        <w:jc w:val="both"/>
         <w:rPr/>
       </w:pPr>
       <w:r>
@@ -934,18 +931,16 @@
     <w:p>
       <w:pPr>
         <w:pStyle w:val="Normal"/>
-        <w:jc w:val="both"/>
         <w:rPr/>
       </w:pPr>
       <w:r>
         <w:rPr/>
-        <w:t>A diferença descritiva entre as médias foi de 0,45 ponto no escore bruto e 14,8 pontos na escala de proficiência. Esses valores não devem ser interpretados isoladamente como crescimento longitudinal: as bases têm tamanhos distintos e o relatório não estabelece que os estudantes, a cobertura curricular e as condições de aplicação sejam equivalentes.</w:t>
+        <w:t>A diferença descritiva entre as médias foi de 0,45 ponto no escore bruto e 24,2 pontos na escala de proficiência. Esses valores não devem ser interpretados isoladamente como crescimento longitudinal: as bases têm tamanhos distintos e o relatório não estabelece que os estudantes, a cobertura curricular e as condições de aplicação sejam equivalentes.</w:t>
       </w:r>
     </w:p>
     <w:p>
       <w:pPr>
         <w:pStyle w:val="Heading1"/>
-        <w:jc w:val="both"/>
         <w:rPr/>
       </w:pPr>
       <w:r>
@@ -956,18 +951,16 @@
     <w:p>
       <w:pPr>
         <w:pStyle w:val="Normal"/>
-        <w:jc w:val="both"/>
         <w:rPr/>
       </w:pPr>
       <w:r>
         <w:rPr/>
-        <w:t>Foram analisadas as respostas dos estudantes avaliados em Matemática na 3ª série do Ensino Médio. A primeira aplicação reuniu 28.416 registros e a segunda, 28.670. Em cada simulado, a TCM considerou os 26 itens apresentados. A TRI utilizou um modelo logístico de três parâmetros (3PL), com itens conhecidos fixados para posicionamento na escala SAEB e 25 itens em cada calibração após as exclusões técnicas.</w:t>
+        <w:t>Foram analisadas as respostas dos estudantes avaliados em Matemática na 3ª série do Ensino Médio. A primeira aplicação reuniu 28.416 registros e a segunda, 28.670. Em cada simulado, a TCM considerou os 26 itens apresentados. A TRI utilizou um modelo logístico de três parâmetros (3PL), com itens conhecidos fixados para posicionamento na escala SAEB e 26 itens no Simulado I e 25 no Simulado II.</w:t>
       </w:r>
     </w:p>
     <w:p>
       <w:pPr>
         <w:pStyle w:val="Normal"/>
-        <w:jc w:val="both"/>
         <w:rPr/>
       </w:pPr>
       <w:r>
@@ -978,7 +971,6 @@
     <w:p>
       <w:pPr>
         <w:pStyle w:val="Heading2"/>
-        <w:jc w:val="both"/>
         <w:rPr/>
       </w:pPr>
       <w:r>
@@ -989,7 +981,6 @@
     <w:p>
       <w:pPr>
         <w:pStyle w:val="Normal"/>
-        <w:jc w:val="both"/>
         <w:rPr/>
       </w:pPr>
       <w:r>
@@ -1000,7 +991,18 @@
     <w:p>
       <w:pPr>
         <w:pStyle w:val="Heading2"/>
-        <w:jc w:val="both"/>
+        <w:rPr/>
+      </w:pPr>
+      <w:r>
+        <w:rPr/>
+      </w:r>
+      <w:r>
+        <w:br w:type="page"/>
+      </w:r>
+    </w:p>
+    <w:p>
+      <w:pPr>
+        <w:pStyle w:val="Heading2"/>
         <w:rPr/>
       </w:pPr>
       <w:r>
@@ -1011,7 +1013,6 @@
     <w:p>
       <w:pPr>
         <w:pStyle w:val="Normal"/>
-        <w:jc w:val="both"/>
         <w:rPr/>
       </w:pPr>
       <w:r>
@@ -1885,12 +1886,11 @@
     <w:p>
       <w:pPr>
         <w:pStyle w:val="Normal"/>
-        <w:jc w:val="both"/>
         <w:rPr/>
       </w:pPr>
       <w:r>
         <w:rPr/>
-        <w:t>A concentração dos itens entre 0,20 e 0,40 de acerto — 23 itens no Simulado I e 20 no Simulado II — caracteriza instrumentos predominantemente difíceis. Nenhum item alcançou 0,60 de acerto. O Simulado II apresentou seis itens com pelo menos 0,40 de acerto, contra três no Simulado I.</w:t>
+        <w:t>A concentração dos itens entre 0,20 e 0,40 de acerto — 23 itens no Simulado I e 20 no Simulado II — caracteriza instrumentos predominantemente difíceis. Nenhum item alcançou 0,60 de acerto. O Simulado II apresentou 6 itens com pelo menos 0,40 de acerto, contra 3 no Simulado I.</w:t>
       </w:r>
     </w:p>
     <w:p>
@@ -1904,7 +1904,7 @@
           <wp:inline distT="0" distB="0" distL="0" distR="0">
             <wp:extent cx="5806440" cy="3806190"/>
             <wp:effectExtent l="0" t="0" r="0" b="0"/>
-            <wp:docPr id="1" name="Picture 1" descr="Quatro gráficos de barras mostram proporção de acertos e discriminação dos 26 itens nos Simulados I e II; os itens 8 e 14 aparecem destacados em vermelho.&#10;Quatro gráficos de barras mostram proporção de acertos e discriminação dos 26 itens nos Simulados I e II; os itens 8 e 14 aparecem destacados em vermelho."/>
+            <wp:docPr id="1" name="Picture 1" descr="Quatro gráficos de barras mostram a proporção de acertos e a discriminação dos 26 itens nos Simulados I e II. Os itens de atenção aparecem destacados em vermelho.&#10;Quatro gráficos de barras mostram a proporção de acertos e a discriminação dos 26 itens nos Simulados I e II. Os itens de atenção aparecem destacados em vermelho."/>
             <wp:cNvGraphicFramePr>
               <a:graphicFrameLocks xmlns:a="http://schemas.openxmlformats.org/drawingml/2006/main" noChangeAspect="1"/>
             </wp:cNvGraphicFramePr>
@@ -1912,7 +1912,7 @@
               <a:graphicData uri="http://schemas.openxmlformats.org/drawingml/2006/picture">
                 <pic:pic xmlns:pic="http://schemas.openxmlformats.org/drawingml/2006/picture">
                   <pic:nvPicPr>
-                    <pic:cNvPr id="1" name="Picture 1" descr="Quatro gráficos de barras mostram proporção de acertos e discriminação dos 26 itens nos Simulados I e II; os itens 8 e 14 aparecem destacados em vermelho.&#10;Quatro gráficos de barras mostram proporção de acertos e discriminação dos 26 itens nos Simulados I e II; os itens 8 e 14 aparecem destacados em vermelho."/>
+                    <pic:cNvPr id="1" name="Picture 1" descr="Quatro gráficos de barras mostram a proporção de acertos e a discriminação dos 26 itens nos Simulados I e II. Os itens de atenção aparecem destacados em vermelho.&#10;Quatro gráficos de barras mostram a proporção de acertos e a discriminação dos 26 itens nos Simulados I e II. Os itens de atenção aparecem destacados em vermelho."/>
                     <pic:cNvPicPr>
                       <a:picLocks noChangeAspect="1" noChangeArrowheads="1"/>
                     </pic:cNvPicPr>
@@ -1952,7 +1952,7 @@
           <w:color w:val="5F6B76"/>
           <w:sz w:val="18"/>
         </w:rPr>
-        <w:t>Figura 1. Proporção de acertos e discriminação por item. Itens excluídos da TRI destacados em vermelho.</w:t>
+        <w:t>Figura 1. Proporção de acertos e discriminação por item. Itens de atenção destacados em vermelho.</w:t>
       </w:r>
     </w:p>
     <w:p>
@@ -2404,7 +2404,7 @@
                 <w:szCs w:val="22"/>
                 <w:lang w:val="en-US" w:eastAsia="en-US" w:bidi="ar-SA"/>
               </w:rPr>
-              <w:t>Excluído da TRI; revisar gabarito</w:t>
+              <w:t>Mantido na TRI; interpretar com ressalva</w:t>
             </w:r>
           </w:p>
         </w:tc>
@@ -5207,7 +5207,6 @@
     <w:p>
       <w:pPr>
         <w:pStyle w:val="Normal"/>
-        <w:jc w:val="both"/>
         <w:rPr/>
       </w:pPr>
       <w:r>
@@ -5222,7 +5221,6 @@
           <w:left w:val="single" w:sz="18" w:space="8" w:color="B3261E"/>
         </w:pBdr>
         <w:shd w:fill="FDE9E7"/>
-        <w:jc w:val="both"/>
         <w:rPr/>
       </w:pPr>
       <w:r>
@@ -5230,13 +5228,12 @@
           <w:color w:val="6B1D16"/>
           <w:sz w:val="21"/>
         </w:rPr>
-        <w:t>A baixa discriminação, acompanhada de correlação ponto-bisserial próxima de zero, indica que o acerto nesses itens quase não acompanhou o desempenho geral. Esse padrão é compatível com gabarito problemático, ambiguidade ou funcionamento anômalo e justifica a revisão de conteúdo antes de qualquer reutilização.</w:t>
+        <w:t>A baixa discriminação, acompanhada de correlação ponto-bisserial próxima de zero, indica que o acerto nesses itens quase não acompanhou o desempenho geral. Esse padrão é compatível com gabarito problemático, ambiguidade ou funcionamento anômalo. O item 8 foi mantido na TRI como item fixado, mas seus resultados devem continuar acompanhados da ressalva técnica.</w:t>
       </w:r>
     </w:p>
     <w:p>
       <w:pPr>
         <w:pStyle w:val="Heading1"/>
-        <w:jc w:val="both"/>
         <w:rPr/>
       </w:pPr>
       <w:r>
@@ -5576,7 +5573,7 @@
                 <w:szCs w:val="22"/>
                 <w:lang w:val="en-US" w:eastAsia="en-US" w:bidi="ar-SA"/>
               </w:rPr>
-              <w:t>289,8</w:t>
+              <w:t>280,4</w:t>
             </w:r>
           </w:p>
         </w:tc>
@@ -5608,7 +5605,7 @@
                 <w:szCs w:val="22"/>
                 <w:lang w:val="en-US" w:eastAsia="en-US" w:bidi="ar-SA"/>
               </w:rPr>
-              <w:t>288,3 a 291,3</w:t>
+              <w:t>279,0 a 281,7</w:t>
             </w:r>
           </w:p>
         </w:tc>
@@ -5640,7 +5637,7 @@
                 <w:szCs w:val="22"/>
                 <w:lang w:val="en-US" w:eastAsia="en-US" w:bidi="ar-SA"/>
               </w:rPr>
-              <w:t>66,2</w:t>
+              <w:t>60,4</w:t>
             </w:r>
           </w:p>
         </w:tc>
@@ -5672,7 +5669,7 @@
                 <w:szCs w:val="22"/>
                 <w:lang w:val="en-US" w:eastAsia="en-US" w:bidi="ar-SA"/>
               </w:rPr>
-              <w:t>273,1</w:t>
+              <w:t>265,7</w:t>
             </w:r>
           </w:p>
         </w:tc>
@@ -5704,7 +5701,7 @@
                 <w:szCs w:val="22"/>
                 <w:lang w:val="en-US" w:eastAsia="en-US" w:bidi="ar-SA"/>
               </w:rPr>
-              <w:t>236,6 a 337,2</w:t>
+              <w:t>232,5 a 323,1</w:t>
             </w:r>
           </w:p>
         </w:tc>
@@ -5736,7 +5733,7 @@
                 <w:szCs w:val="22"/>
                 <w:lang w:val="en-US" w:eastAsia="en-US" w:bidi="ar-SA"/>
               </w:rPr>
-              <w:t>4</w:t>
+              <w:t>5</w:t>
             </w:r>
           </w:p>
         </w:tc>
@@ -6064,18 +6061,16 @@
     <w:p>
       <w:pPr>
         <w:pStyle w:val="Normal"/>
-        <w:jc w:val="both"/>
         <w:rPr/>
       </w:pPr>
       <w:r>
         <w:rPr/>
-        <w:t>No Simulado I, a proficiência média foi 289,8, com mediana 273,1 e assimetria positiva (0,69). No Simulado II, a média foi 304,6, a mediana 292,7 e a assimetria foi menor (0,48). A proporção na faixa de 350 pontos ou mais foi 21,7% na primeira aplicação e 24,2% na segunda.</w:t>
+        <w:t>No Simulado I, a proficiência média foi 280,4, com mediana 265,7 e assimetria positiva (0,66). No Simulado II, a média foi 304,6, a mediana 292,7 e a assimetria foi 0,48. A proporção na faixa de 350 pontos ou mais foi 17,7% na primeira aplicação e 24,2% na segunda.</w:t>
       </w:r>
     </w:p>
     <w:p>
       <w:pPr>
         <w:pStyle w:val="Heading2"/>
-        <w:jc w:val="both"/>
         <w:rPr/>
       </w:pPr>
       <w:r>
@@ -6086,12 +6081,11 @@
     <w:p>
       <w:pPr>
         <w:pStyle w:val="Normal"/>
-        <w:jc w:val="both"/>
         <w:rPr/>
       </w:pPr>
       <w:r>
         <w:rPr/>
-        <w:t>No Simulado I, nove itens apresentaram dificuldade estimada acima de 400 pontos na escala SAEB (2, 3, 4, 7, 14, 15, 16, 17 e 24); os itens 16 e 24, além disso, tiveram discriminação inferior a 0,60. No Simulado II, apenas o item 2 ficou acima de 400 pontos, e os itens 5 e 25 apresentaram discriminações muito elevadas (a &gt; 4), valores que merecem conferência conjunta com erros-padrão e curvas do item.</w:t>
+        <w:t>Simulado I: 4 itens com bSAEB acima de 400, 3 itens com a abaixo de 0,60 e 1 item com c acima de 0,25; Simulado II: 1 item com bSAEB acima de 400, 1 item com a abaixo de 0,60 e 0 itens com c acima de 0,25. Esses valores são sinais diagnósticos e devem ser conferidos em conjunto com erros-padrão, ajuste e curvas do item.</w:t>
       </w:r>
     </w:p>
     <w:tbl>
@@ -6318,7 +6312,7 @@
                 <w:szCs w:val="22"/>
                 <w:lang w:val="en-US" w:eastAsia="en-US" w:bidi="ar-SA"/>
               </w:rPr>
-              <w:t>2, 3, 4, 7, 14, 15, 16, 17 e 24</w:t>
+              <w:t>2, 3, 15, 24</w:t>
             </w:r>
           </w:p>
         </w:tc>
@@ -6419,7 +6413,7 @@
                 <w:szCs w:val="22"/>
                 <w:lang w:val="en-US" w:eastAsia="en-US" w:bidi="ar-SA"/>
               </w:rPr>
-              <w:t>2, 16 e 24</w:t>
+              <w:t>2, 16, 24</w:t>
             </w:r>
           </w:p>
         </w:tc>
@@ -6690,6 +6684,107 @@
                 <w:szCs w:val="22"/>
                 <w:lang w:val="en-US" w:eastAsia="en-US" w:bidi="ar-SA"/>
               </w:rPr>
+              <w:t>a &lt; 0,60</w:t>
+            </w:r>
+          </w:p>
+        </w:tc>
+        <w:tc>
+          <w:tcPr>
+            <w:tcW w:w="5611" w:type="dxa"/>
+            <w:tcBorders/>
+            <w:vAlign w:val="center"/>
+          </w:tcPr>
+          <w:p>
+            <w:pPr>
+              <w:pStyle w:val="Normal"/>
+              <w:widowControl/>
+              <w:spacing w:before="0" w:after="0"/>
+              <w:jc w:val="left"/>
+              <w:rPr>
+                <w:rFonts w:eastAsia="ＭＳ 明朝" w:cs=""/>
+                <w:kern w:val="0"/>
+                <w:szCs w:val="22"/>
+                <w:lang w:val="en-US" w:eastAsia="en-US" w:bidi="ar-SA"/>
+              </w:rPr>
+            </w:pPr>
+            <w:r>
+              <w:rPr>
+                <w:rFonts w:eastAsia="ＭＳ 明朝" w:cs=""/>
+                <w:color w:val="222222"/>
+                <w:kern w:val="0"/>
+                <w:sz w:val="18"/>
+                <w:szCs w:val="22"/>
+                <w:lang w:val="en-US" w:eastAsia="en-US" w:bidi="ar-SA"/>
+              </w:rPr>
+              <w:t>2</w:t>
+            </w:r>
+          </w:p>
+        </w:tc>
+      </w:tr>
+      <w:tr>
+        <w:trPr>
+          <w:cantSplit w:val="true"/>
+        </w:trPr>
+        <w:tc>
+          <w:tcPr>
+            <w:tcW w:w="1449" w:type="dxa"/>
+            <w:tcBorders/>
+            <w:vAlign w:val="center"/>
+          </w:tcPr>
+          <w:p>
+            <w:pPr>
+              <w:pStyle w:val="Normal"/>
+              <w:widowControl/>
+              <w:spacing w:before="0" w:after="0"/>
+              <w:jc w:val="left"/>
+              <w:rPr>
+                <w:rFonts w:eastAsia="ＭＳ 明朝" w:cs=""/>
+                <w:kern w:val="0"/>
+                <w:szCs w:val="22"/>
+                <w:lang w:val="en-US" w:eastAsia="en-US" w:bidi="ar-SA"/>
+              </w:rPr>
+            </w:pPr>
+            <w:r>
+              <w:rPr>
+                <w:rFonts w:eastAsia="ＭＳ 明朝" w:cs=""/>
+                <w:color w:val="222222"/>
+                <w:kern w:val="0"/>
+                <w:sz w:val="18"/>
+                <w:szCs w:val="22"/>
+                <w:lang w:val="en-US" w:eastAsia="en-US" w:bidi="ar-SA"/>
+              </w:rPr>
+              <w:t>Simulado II</w:t>
+            </w:r>
+          </w:p>
+        </w:tc>
+        <w:tc>
+          <w:tcPr>
+            <w:tcW w:w="2300" w:type="dxa"/>
+            <w:tcBorders/>
+            <w:vAlign w:val="center"/>
+          </w:tcPr>
+          <w:p>
+            <w:pPr>
+              <w:pStyle w:val="Normal"/>
+              <w:widowControl/>
+              <w:spacing w:before="0" w:after="0"/>
+              <w:jc w:val="left"/>
+              <w:rPr>
+                <w:rFonts w:eastAsia="ＭＳ 明朝" w:cs=""/>
+                <w:kern w:val="0"/>
+                <w:szCs w:val="22"/>
+                <w:lang w:val="en-US" w:eastAsia="en-US" w:bidi="ar-SA"/>
+              </w:rPr>
+            </w:pPr>
+            <w:r>
+              <w:rPr>
+                <w:rFonts w:eastAsia="ＭＳ 明朝" w:cs=""/>
+                <w:color w:val="222222"/>
+                <w:kern w:val="0"/>
+                <w:sz w:val="18"/>
+                <w:szCs w:val="22"/>
+                <w:lang w:val="en-US" w:eastAsia="en-US" w:bidi="ar-SA"/>
+              </w:rPr>
               <w:t>a &gt; 4,00</w:t>
             </w:r>
           </w:p>
@@ -6722,7 +6817,7 @@
                 <w:szCs w:val="22"/>
                 <w:lang w:val="en-US" w:eastAsia="en-US" w:bidi="ar-SA"/>
               </w:rPr>
-              <w:t>5 e 25</w:t>
+              <w:t>5, 25</w:t>
             </w:r>
           </w:p>
         </w:tc>
@@ -6755,7 +6850,6 @@
     <w:p>
       <w:pPr>
         <w:pStyle w:val="Normal"/>
-        <w:jc w:val="both"/>
         <w:rPr/>
       </w:pPr>
       <w:r>
@@ -7389,7 +7483,7 @@
                 <w:szCs w:val="22"/>
                 <w:lang w:val="en-US" w:eastAsia="en-US" w:bidi="ar-SA"/>
               </w:rPr>
-              <w:t>289,8</w:t>
+              <w:t>280,4</w:t>
             </w:r>
           </w:p>
         </w:tc>
@@ -7453,7 +7547,7 @@
                 <w:szCs w:val="22"/>
                 <w:lang w:val="en-US" w:eastAsia="en-US" w:bidi="ar-SA"/>
               </w:rPr>
-              <w:t>+14,8</w:t>
+              <w:t>+24,2</w:t>
             </w:r>
           </w:p>
         </w:tc>
@@ -7522,7 +7616,7 @@
                 <w:szCs w:val="22"/>
                 <w:lang w:val="en-US" w:eastAsia="en-US" w:bidi="ar-SA"/>
               </w:rPr>
-              <w:t>66,2</w:t>
+              <w:t>60,4</w:t>
             </w:r>
           </w:p>
         </w:tc>
@@ -7586,7 +7680,7 @@
                 <w:szCs w:val="22"/>
                 <w:lang w:val="en-US" w:eastAsia="en-US" w:bidi="ar-SA"/>
               </w:rPr>
-              <w:t>-13,4</w:t>
+              <w:t>-7,6</w:t>
             </w:r>
           </w:p>
         </w:tc>
@@ -7655,7 +7749,7 @@
                 <w:szCs w:val="22"/>
                 <w:lang w:val="en-US" w:eastAsia="en-US" w:bidi="ar-SA"/>
               </w:rPr>
-              <w:t>21,7%</w:t>
+              <w:t>17,7%</w:t>
             </w:r>
           </w:p>
         </w:tc>
@@ -7719,7 +7813,7 @@
                 <w:szCs w:val="22"/>
                 <w:lang w:val="en-US" w:eastAsia="en-US" w:bidi="ar-SA"/>
               </w:rPr>
-              <w:t>+2,5 p.p.</w:t>
+              <w:t>+6,6 p.p.</w:t>
             </w:r>
           </w:p>
         </w:tc>
@@ -7761,7 +7855,22 @@
       </w:pPr>
       <w:r>
         <w:rPr/>
-        <w:t>Revisar formalmente os gabaritos e o conteúdo dos itens 8 (Simulado I) e 14 (Simulado II), documentando a decisão final e impedindo reutilização até a conclusão da análise.</w:t>
+        <w:t>Manter documentada a ressalva do item 8 do Simulado I, que permaneceu na TRI como item fixado, e evitar interpretação isolada de seu desempenho.</w:t>
+      </w:r>
+    </w:p>
+    <w:p>
+      <w:pPr>
+        <w:pStyle w:val="ListNumber"/>
+        <w:numPr>
+          <w:ilvl w:val="0"/>
+          <w:numId w:val="4"/>
+        </w:numPr>
+        <w:ind w:hanging="360" w:left="720"/>
+        <w:rPr/>
+      </w:pPr>
+      <w:r>
+        <w:rPr/>
+        <w:t>Revisar formalmente o gabarito e o conteúdo do item 14 do Simulado II, que permaneceu excluído da TRI.</w:t>
       </w:r>
     </w:p>
     <w:p>
@@ -12512,6 +12621,18 @@
     </w:p>
     <w:p>
       <w:pPr>
+        <w:pStyle w:val="Normal"/>
+        <w:rPr/>
+      </w:pPr>
+      <w:r>
+        <w:rPr/>
+      </w:r>
+      <w:r>
+        <w:br w:type="page"/>
+      </w:r>
+    </w:p>
+    <w:p>
+      <w:pPr>
         <w:pStyle w:val="Heading2"/>
         <w:spacing w:before="0" w:after="120"/>
         <w:rPr/>
@@ -17748,7 +17869,7 @@
                 <w:szCs w:val="22"/>
                 <w:lang w:val="en-US" w:eastAsia="en-US" w:bidi="ar-SA"/>
               </w:rPr>
-              <w:t>1,278</w:t>
+              <w:t>1,496</w:t>
             </w:r>
           </w:p>
         </w:tc>
@@ -17780,7 +17901,7 @@
                 <w:szCs w:val="22"/>
                 <w:lang w:val="en-US" w:eastAsia="en-US" w:bidi="ar-SA"/>
               </w:rPr>
-              <w:t>3,730</w:t>
+              <w:t>3,248</w:t>
             </w:r>
           </w:p>
         </w:tc>
@@ -17812,7 +17933,7 @@
                 <w:szCs w:val="22"/>
                 <w:lang w:val="en-US" w:eastAsia="en-US" w:bidi="ar-SA"/>
               </w:rPr>
-              <w:t>436,5</w:t>
+              <w:t>412,4</w:t>
             </w:r>
           </w:p>
         </w:tc>
@@ -17844,7 +17965,7 @@
                 <w:szCs w:val="22"/>
                 <w:lang w:val="en-US" w:eastAsia="en-US" w:bidi="ar-SA"/>
               </w:rPr>
-              <w:t>0,236</w:t>
+              <w:t>0,239</w:t>
             </w:r>
           </w:p>
         </w:tc>
@@ -17945,7 +18066,7 @@
                 <w:szCs w:val="22"/>
                 <w:lang w:val="en-US" w:eastAsia="en-US" w:bidi="ar-SA"/>
               </w:rPr>
-              <w:t>1,004</w:t>
+              <w:t>1,153</w:t>
             </w:r>
           </w:p>
         </w:tc>
@@ -17977,7 +18098,7 @@
                 <w:szCs w:val="22"/>
                 <w:lang w:val="en-US" w:eastAsia="en-US" w:bidi="ar-SA"/>
               </w:rPr>
-              <w:t>3,119</w:t>
+              <w:t>2,732</w:t>
             </w:r>
           </w:p>
         </w:tc>
@@ -18009,7 +18130,7 @@
                 <w:szCs w:val="22"/>
                 <w:lang w:val="en-US" w:eastAsia="en-US" w:bidi="ar-SA"/>
               </w:rPr>
-              <w:t>406,0</w:t>
+              <w:t>386,6</w:t>
             </w:r>
           </w:p>
         </w:tc>
@@ -18041,7 +18162,7 @@
                 <w:szCs w:val="22"/>
                 <w:lang w:val="en-US" w:eastAsia="en-US" w:bidi="ar-SA"/>
               </w:rPr>
-              <w:t>0,102</w:t>
+              <w:t>0,108</w:t>
             </w:r>
           </w:p>
         </w:tc>
@@ -18142,7 +18263,7 @@
                 <w:szCs w:val="22"/>
                 <w:lang w:val="en-US" w:eastAsia="en-US" w:bidi="ar-SA"/>
               </w:rPr>
-              <w:t>1,578</w:t>
+              <w:t>1,798</w:t>
             </w:r>
           </w:p>
         </w:tc>
@@ -18174,7 +18295,7 @@
                 <w:szCs w:val="22"/>
                 <w:lang w:val="en-US" w:eastAsia="en-US" w:bidi="ar-SA"/>
               </w:rPr>
-              <w:t>2,517</w:t>
+              <w:t>2,198</w:t>
             </w:r>
           </w:p>
         </w:tc>
@@ -18206,7 +18327,7 @@
                 <w:szCs w:val="22"/>
                 <w:lang w:val="en-US" w:eastAsia="en-US" w:bidi="ar-SA"/>
               </w:rPr>
-              <w:t>375,9</w:t>
+              <w:t>359,9</w:t>
             </w:r>
           </w:p>
         </w:tc>
@@ -18238,7 +18359,7 @@
                 <w:szCs w:val="22"/>
                 <w:lang w:val="en-US" w:eastAsia="en-US" w:bidi="ar-SA"/>
               </w:rPr>
-              <w:t>0,138</w:t>
+              <w:t>0,144</w:t>
             </w:r>
           </w:p>
         </w:tc>
@@ -18339,7 +18460,7 @@
                 <w:szCs w:val="22"/>
                 <w:lang w:val="en-US" w:eastAsia="en-US" w:bidi="ar-SA"/>
               </w:rPr>
-              <w:t>2,036</w:t>
+              <w:t>2,276</w:t>
             </w:r>
           </w:p>
         </w:tc>
@@ -18371,7 +18492,7 @@
                 <w:szCs w:val="22"/>
                 <w:lang w:val="en-US" w:eastAsia="en-US" w:bidi="ar-SA"/>
               </w:rPr>
-              <w:t>2,189</w:t>
+              <w:t>1,899</w:t>
             </w:r>
           </w:p>
         </w:tc>
@@ -18403,7 +18524,7 @@
                 <w:szCs w:val="22"/>
                 <w:lang w:val="en-US" w:eastAsia="en-US" w:bidi="ar-SA"/>
               </w:rPr>
-              <w:t>359,5</w:t>
+              <w:t>345,0</w:t>
             </w:r>
           </w:p>
         </w:tc>
@@ -18435,7 +18556,7 @@
                 <w:szCs w:val="22"/>
                 <w:lang w:val="en-US" w:eastAsia="en-US" w:bidi="ar-SA"/>
               </w:rPr>
-              <w:t>0,170</w:t>
+              <w:t>0,174</w:t>
             </w:r>
           </w:p>
         </w:tc>
@@ -18536,7 +18657,7 @@
                 <w:szCs w:val="22"/>
                 <w:lang w:val="en-US" w:eastAsia="en-US" w:bidi="ar-SA"/>
               </w:rPr>
-              <w:t>1,660</w:t>
+              <w:t>1,984</w:t>
             </w:r>
           </w:p>
         </w:tc>
@@ -18568,7 +18689,7 @@
                 <w:szCs w:val="22"/>
                 <w:lang w:val="en-US" w:eastAsia="en-US" w:bidi="ar-SA"/>
               </w:rPr>
-              <w:t>3,444</w:t>
+              <w:t>2,995</w:t>
             </w:r>
           </w:p>
         </w:tc>
@@ -18600,7 +18721,7 @@
                 <w:szCs w:val="22"/>
                 <w:lang w:val="en-US" w:eastAsia="en-US" w:bidi="ar-SA"/>
               </w:rPr>
-              <w:t>422,2</w:t>
+              <w:t>399,7</w:t>
             </w:r>
           </w:p>
         </w:tc>
@@ -18632,7 +18753,7 @@
                 <w:szCs w:val="22"/>
                 <w:lang w:val="en-US" w:eastAsia="en-US" w:bidi="ar-SA"/>
               </w:rPr>
-              <w:t>0,131</w:t>
+              <w:t>0,134</w:t>
             </w:r>
           </w:p>
         </w:tc>
@@ -18701,7 +18822,7 @@
                 <w:szCs w:val="22"/>
                 <w:lang w:val="en-US" w:eastAsia="en-US" w:bidi="ar-SA"/>
               </w:rPr>
-              <w:t>009</w:t>
+              <w:t>008</w:t>
             </w:r>
           </w:p>
         </w:tc>
@@ -18733,7 +18854,7 @@
                 <w:szCs w:val="22"/>
                 <w:lang w:val="en-US" w:eastAsia="en-US" w:bidi="ar-SA"/>
               </w:rPr>
-              <w:t>1,168</w:t>
+              <w:t>0,684</w:t>
             </w:r>
           </w:p>
         </w:tc>
@@ -18765,7 +18886,7 @@
                 <w:szCs w:val="22"/>
                 <w:lang w:val="en-US" w:eastAsia="en-US" w:bidi="ar-SA"/>
               </w:rPr>
-              <w:t>1,888</w:t>
+              <w:t>0,945</w:t>
             </w:r>
           </w:p>
         </w:tc>
@@ -18797,7 +18918,7 @@
                 <w:szCs w:val="22"/>
                 <w:lang w:val="en-US" w:eastAsia="en-US" w:bidi="ar-SA"/>
               </w:rPr>
-              <w:t>344,4</w:t>
+              <w:t>297,2</w:t>
             </w:r>
           </w:p>
         </w:tc>
@@ -18829,7 +18950,7 @@
                 <w:szCs w:val="22"/>
                 <w:lang w:val="en-US" w:eastAsia="en-US" w:bidi="ar-SA"/>
               </w:rPr>
-              <w:t>0,113</w:t>
+              <w:t>0,056</w:t>
             </w:r>
           </w:p>
         </w:tc>
@@ -18898,7 +19019,7 @@
                 <w:szCs w:val="22"/>
                 <w:lang w:val="en-US" w:eastAsia="en-US" w:bidi="ar-SA"/>
               </w:rPr>
-              <w:t>010</w:t>
+              <w:t>009</w:t>
             </w:r>
           </w:p>
         </w:tc>
@@ -18930,7 +19051,7 @@
                 <w:szCs w:val="22"/>
                 <w:lang w:val="en-US" w:eastAsia="en-US" w:bidi="ar-SA"/>
               </w:rPr>
-              <w:t>2,538</w:t>
+              <w:t>1,168</w:t>
             </w:r>
           </w:p>
         </w:tc>
@@ -18962,7 +19083,7 @@
                 <w:szCs w:val="22"/>
                 <w:lang w:val="en-US" w:eastAsia="en-US" w:bidi="ar-SA"/>
               </w:rPr>
-              <w:t>2,736</w:t>
+              <w:t>1,888</w:t>
             </w:r>
           </w:p>
         </w:tc>
@@ -18994,7 +19115,7 @@
                 <w:szCs w:val="22"/>
                 <w:lang w:val="en-US" w:eastAsia="en-US" w:bidi="ar-SA"/>
               </w:rPr>
-              <w:t>386,8</w:t>
+              <w:t>344,4</w:t>
             </w:r>
           </w:p>
         </w:tc>
@@ -19026,7 +19147,7 @@
                 <w:szCs w:val="22"/>
                 <w:lang w:val="en-US" w:eastAsia="en-US" w:bidi="ar-SA"/>
               </w:rPr>
-              <w:t>0,257</w:t>
+              <w:t>0,113</w:t>
             </w:r>
           </w:p>
         </w:tc>
@@ -19058,7 +19179,7 @@
                 <w:szCs w:val="22"/>
                 <w:lang w:val="en-US" w:eastAsia="en-US" w:bidi="ar-SA"/>
               </w:rPr>
-              <w:t>Não</w:t>
+              <w:t>Sim</w:t>
             </w:r>
           </w:p>
         </w:tc>
@@ -19095,7 +19216,7 @@
                 <w:szCs w:val="22"/>
                 <w:lang w:val="en-US" w:eastAsia="en-US" w:bidi="ar-SA"/>
               </w:rPr>
-              <w:t>011</w:t>
+              <w:t>010</w:t>
             </w:r>
           </w:p>
         </w:tc>
@@ -19127,7 +19248,7 @@
                 <w:szCs w:val="22"/>
                 <w:lang w:val="en-US" w:eastAsia="en-US" w:bidi="ar-SA"/>
               </w:rPr>
-              <w:t>0,973</w:t>
+              <w:t>2,806</w:t>
             </w:r>
           </w:p>
         </w:tc>
@@ -19159,7 +19280,7 @@
                 <w:szCs w:val="22"/>
                 <w:lang w:val="en-US" w:eastAsia="en-US" w:bidi="ar-SA"/>
               </w:rPr>
-              <w:t>1,365</w:t>
+              <w:t>2,391</w:t>
             </w:r>
           </w:p>
         </w:tc>
@@ -19191,7 +19312,7 @@
                 <w:szCs w:val="22"/>
                 <w:lang w:val="en-US" w:eastAsia="en-US" w:bidi="ar-SA"/>
               </w:rPr>
-              <w:t>318,3</w:t>
+              <w:t>369,6</w:t>
             </w:r>
           </w:p>
         </w:tc>
@@ -19223,7 +19344,7 @@
                 <w:szCs w:val="22"/>
                 <w:lang w:val="en-US" w:eastAsia="en-US" w:bidi="ar-SA"/>
               </w:rPr>
-              <w:t>0,120</w:t>
+              <w:t>0,257</w:t>
             </w:r>
           </w:p>
         </w:tc>
@@ -19292,7 +19413,7 @@
                 <w:szCs w:val="22"/>
                 <w:lang w:val="en-US" w:eastAsia="en-US" w:bidi="ar-SA"/>
               </w:rPr>
-              <w:t>012</w:t>
+              <w:t>011</w:t>
             </w:r>
           </w:p>
         </w:tc>
@@ -19324,7 +19445,7 @@
                 <w:szCs w:val="22"/>
                 <w:lang w:val="en-US" w:eastAsia="en-US" w:bidi="ar-SA"/>
               </w:rPr>
-              <w:t>1,780</w:t>
+              <w:t>1,067</w:t>
             </w:r>
           </w:p>
         </w:tc>
@@ -19356,7 +19477,7 @@
                 <w:szCs w:val="22"/>
                 <w:lang w:val="en-US" w:eastAsia="en-US" w:bidi="ar-SA"/>
               </w:rPr>
-              <w:t>1,876</w:t>
+              <w:t>1,108</w:t>
             </w:r>
           </w:p>
         </w:tc>
@@ -19388,7 +19509,7 @@
                 <w:szCs w:val="22"/>
                 <w:lang w:val="en-US" w:eastAsia="en-US" w:bidi="ar-SA"/>
               </w:rPr>
-              <w:t>343,8</w:t>
+              <w:t>305,4</w:t>
             </w:r>
           </w:p>
         </w:tc>
@@ -19420,7 +19541,7 @@
                 <w:szCs w:val="22"/>
                 <w:lang w:val="en-US" w:eastAsia="en-US" w:bidi="ar-SA"/>
               </w:rPr>
-              <w:t>0,130</w:t>
+              <w:t>0,114</w:t>
             </w:r>
           </w:p>
         </w:tc>
@@ -19489,7 +19610,7 @@
                 <w:szCs w:val="22"/>
                 <w:lang w:val="en-US" w:eastAsia="en-US" w:bidi="ar-SA"/>
               </w:rPr>
-              <w:t>013</w:t>
+              <w:t>012</w:t>
             </w:r>
           </w:p>
         </w:tc>
@@ -19521,7 +19642,7 @@
                 <w:szCs w:val="22"/>
                 <w:lang w:val="en-US" w:eastAsia="en-US" w:bidi="ar-SA"/>
               </w:rPr>
-              <w:t>1,084</w:t>
+              <w:t>1,905</w:t>
             </w:r>
           </w:p>
         </w:tc>
@@ -19553,7 +19674,7 @@
                 <w:szCs w:val="22"/>
                 <w:lang w:val="en-US" w:eastAsia="en-US" w:bidi="ar-SA"/>
               </w:rPr>
-              <w:t>1,992</w:t>
+              <w:t>1,583</w:t>
             </w:r>
           </w:p>
         </w:tc>
@@ -19585,7 +19706,7 @@
                 <w:szCs w:val="22"/>
                 <w:lang w:val="en-US" w:eastAsia="en-US" w:bidi="ar-SA"/>
               </w:rPr>
-              <w:t>349,6</w:t>
+              <w:t>329,1</w:t>
             </w:r>
           </w:p>
         </w:tc>
@@ -19617,7 +19738,7 @@
                 <w:szCs w:val="22"/>
                 <w:lang w:val="en-US" w:eastAsia="en-US" w:bidi="ar-SA"/>
               </w:rPr>
-              <w:t>0,119</w:t>
+              <w:t>0,126</w:t>
             </w:r>
           </w:p>
         </w:tc>
@@ -19686,7 +19807,7 @@
                 <w:szCs w:val="22"/>
                 <w:lang w:val="en-US" w:eastAsia="en-US" w:bidi="ar-SA"/>
               </w:rPr>
-              <w:t>014</w:t>
+              <w:t>013</w:t>
             </w:r>
           </w:p>
         </w:tc>
@@ -19718,7 +19839,7 @@
                 <w:szCs w:val="22"/>
                 <w:lang w:val="en-US" w:eastAsia="en-US" w:bidi="ar-SA"/>
               </w:rPr>
-              <w:t>0,865</w:t>
+              <w:t>1,197</w:t>
             </w:r>
           </w:p>
         </w:tc>
@@ -19750,7 +19871,7 @@
                 <w:szCs w:val="22"/>
                 <w:lang w:val="en-US" w:eastAsia="en-US" w:bidi="ar-SA"/>
               </w:rPr>
-              <w:t>3,275</w:t>
+              <w:t>1,697</w:t>
             </w:r>
           </w:p>
         </w:tc>
@@ -19782,7 +19903,7 @@
                 <w:szCs w:val="22"/>
                 <w:lang w:val="en-US" w:eastAsia="en-US" w:bidi="ar-SA"/>
               </w:rPr>
-              <w:t>413,8</w:t>
+              <w:t>334,8</w:t>
             </w:r>
           </w:p>
         </w:tc>
@@ -19814,7 +19935,7 @@
                 <w:szCs w:val="22"/>
                 <w:lang w:val="en-US" w:eastAsia="en-US" w:bidi="ar-SA"/>
               </w:rPr>
-              <w:t>0,149</w:t>
+              <w:t>0,118</w:t>
             </w:r>
           </w:p>
         </w:tc>
@@ -19883,7 +20004,7 @@
                 <w:szCs w:val="22"/>
                 <w:lang w:val="en-US" w:eastAsia="en-US" w:bidi="ar-SA"/>
               </w:rPr>
-              <w:t>015</w:t>
+              <w:t>014</w:t>
             </w:r>
           </w:p>
         </w:tc>
@@ -19915,7 +20036,7 @@
                 <w:szCs w:val="22"/>
                 <w:lang w:val="en-US" w:eastAsia="en-US" w:bidi="ar-SA"/>
               </w:rPr>
-              <w:t>1,587</w:t>
+              <w:t>1,017</w:t>
             </w:r>
           </w:p>
         </w:tc>
@@ -19947,7 +20068,7 @@
                 <w:szCs w:val="22"/>
                 <w:lang w:val="en-US" w:eastAsia="en-US" w:bidi="ar-SA"/>
               </w:rPr>
-              <w:t>3,828</w:t>
+              <w:t>2,864</w:t>
             </w:r>
           </w:p>
         </w:tc>
@@ -19979,7 +20100,7 @@
                 <w:szCs w:val="22"/>
                 <w:lang w:val="en-US" w:eastAsia="en-US" w:bidi="ar-SA"/>
               </w:rPr>
-              <w:t>441,4</w:t>
+              <w:t>393,2</w:t>
             </w:r>
           </w:p>
         </w:tc>
@@ -20011,7 +20132,7 @@
                 <w:szCs w:val="22"/>
                 <w:lang w:val="en-US" w:eastAsia="en-US" w:bidi="ar-SA"/>
               </w:rPr>
-              <w:t>0,166</w:t>
+              <w:t>0,158</w:t>
             </w:r>
           </w:p>
         </w:tc>
@@ -20080,7 +20201,7 @@
                 <w:szCs w:val="22"/>
                 <w:lang w:val="en-US" w:eastAsia="en-US" w:bidi="ar-SA"/>
               </w:rPr>
-              <w:t>016</w:t>
+              <w:t>015</w:t>
             </w:r>
           </w:p>
         </w:tc>
@@ -20112,7 +20233,7 @@
                 <w:szCs w:val="22"/>
                 <w:lang w:val="en-US" w:eastAsia="en-US" w:bidi="ar-SA"/>
               </w:rPr>
-              <w:t>0,479</w:t>
+              <w:t>1,843</w:t>
             </w:r>
           </w:p>
         </w:tc>
@@ -20144,7 +20265,7 @@
                 <w:szCs w:val="22"/>
                 <w:lang w:val="en-US" w:eastAsia="en-US" w:bidi="ar-SA"/>
               </w:rPr>
-              <w:t>3,419</w:t>
+              <w:t>3,329</w:t>
             </w:r>
           </w:p>
         </w:tc>
@@ -20176,7 +20297,7 @@
                 <w:szCs w:val="22"/>
                 <w:lang w:val="en-US" w:eastAsia="en-US" w:bidi="ar-SA"/>
               </w:rPr>
-              <w:t>420,9</w:t>
+              <w:t>416,5</w:t>
             </w:r>
           </w:p>
         </w:tc>
@@ -20208,7 +20329,7 @@
                 <w:szCs w:val="22"/>
                 <w:lang w:val="en-US" w:eastAsia="en-US" w:bidi="ar-SA"/>
               </w:rPr>
-              <w:t>0,088</w:t>
+              <w:t>0,166</w:t>
             </w:r>
           </w:p>
         </w:tc>
@@ -20277,7 +20398,7 @@
                 <w:szCs w:val="22"/>
                 <w:lang w:val="en-US" w:eastAsia="en-US" w:bidi="ar-SA"/>
               </w:rPr>
-              <w:t>017</w:t>
+              <w:t>016</w:t>
             </w:r>
           </w:p>
         </w:tc>
@@ -20309,7 +20430,7 @@
                 <w:szCs w:val="22"/>
                 <w:lang w:val="en-US" w:eastAsia="en-US" w:bidi="ar-SA"/>
               </w:rPr>
-              <w:t>1,349</w:t>
+              <w:t>0,528</w:t>
             </w:r>
           </w:p>
         </w:tc>
@@ -20341,7 +20462,7 @@
                 <w:szCs w:val="22"/>
                 <w:lang w:val="en-US" w:eastAsia="en-US" w:bidi="ar-SA"/>
               </w:rPr>
-              <w:t>3,318</w:t>
+              <w:t>2,942</w:t>
             </w:r>
           </w:p>
         </w:tc>
@@ -20373,7 +20494,7 @@
                 <w:szCs w:val="22"/>
                 <w:lang w:val="en-US" w:eastAsia="en-US" w:bidi="ar-SA"/>
               </w:rPr>
-              <w:t>415,9</w:t>
+              <w:t>397,1</w:t>
             </w:r>
           </w:p>
         </w:tc>
@@ -20405,7 +20526,7 @@
                 <w:szCs w:val="22"/>
                 <w:lang w:val="en-US" w:eastAsia="en-US" w:bidi="ar-SA"/>
               </w:rPr>
-              <w:t>0,244</w:t>
+              <w:t>0,083</w:t>
             </w:r>
           </w:p>
         </w:tc>
@@ -20474,7 +20595,7 @@
                 <w:szCs w:val="22"/>
                 <w:lang w:val="en-US" w:eastAsia="en-US" w:bidi="ar-SA"/>
               </w:rPr>
-              <w:t>018</w:t>
+              <w:t>017</w:t>
             </w:r>
           </w:p>
         </w:tc>
@@ -20506,7 +20627,7 @@
                 <w:szCs w:val="22"/>
                 <w:lang w:val="en-US" w:eastAsia="en-US" w:bidi="ar-SA"/>
               </w:rPr>
-              <w:t>1,622</w:t>
+              <w:t>1,605</w:t>
             </w:r>
           </w:p>
         </w:tc>
@@ -20538,7 +20659,7 @@
                 <w:szCs w:val="22"/>
                 <w:lang w:val="en-US" w:eastAsia="en-US" w:bidi="ar-SA"/>
               </w:rPr>
-              <w:t>2,838</w:t>
+              <w:t>2,888</w:t>
             </w:r>
           </w:p>
         </w:tc>
@@ -20570,7 +20691,7 @@
                 <w:szCs w:val="22"/>
                 <w:lang w:val="en-US" w:eastAsia="en-US" w:bidi="ar-SA"/>
               </w:rPr>
-              <w:t>391,9</w:t>
+              <w:t>394,4</w:t>
             </w:r>
           </w:p>
         </w:tc>
@@ -20602,7 +20723,7 @@
                 <w:szCs w:val="22"/>
                 <w:lang w:val="en-US" w:eastAsia="en-US" w:bidi="ar-SA"/>
               </w:rPr>
-              <w:t>0,167</w:t>
+              <w:t>0,248</w:t>
             </w:r>
           </w:p>
         </w:tc>
@@ -20671,7 +20792,7 @@
                 <w:szCs w:val="22"/>
                 <w:lang w:val="en-US" w:eastAsia="en-US" w:bidi="ar-SA"/>
               </w:rPr>
-              <w:t>019</w:t>
+              <w:t>018</w:t>
             </w:r>
           </w:p>
         </w:tc>
@@ -20703,7 +20824,7 @@
                 <w:szCs w:val="22"/>
                 <w:lang w:val="en-US" w:eastAsia="en-US" w:bidi="ar-SA"/>
               </w:rPr>
-              <w:t>2,462</w:t>
+              <w:t>1,846</w:t>
             </w:r>
           </w:p>
         </w:tc>
@@ -20735,7 +20856,7 @@
                 <w:szCs w:val="22"/>
                 <w:lang w:val="en-US" w:eastAsia="en-US" w:bidi="ar-SA"/>
               </w:rPr>
-              <w:t>2,405</w:t>
+              <w:t>2,480</w:t>
             </w:r>
           </w:p>
         </w:tc>
@@ -20767,7 +20888,7 @@
                 <w:szCs w:val="22"/>
                 <w:lang w:val="en-US" w:eastAsia="en-US" w:bidi="ar-SA"/>
               </w:rPr>
-              <w:t>370,3</w:t>
+              <w:t>374,0</w:t>
             </w:r>
           </w:p>
         </w:tc>
@@ -20799,7 +20920,7 @@
                 <w:szCs w:val="22"/>
                 <w:lang w:val="en-US" w:eastAsia="en-US" w:bidi="ar-SA"/>
               </w:rPr>
-              <w:t>0,188</w:t>
+              <w:t>0,170</w:t>
             </w:r>
           </w:p>
         </w:tc>
@@ -20868,7 +20989,7 @@
                 <w:szCs w:val="22"/>
                 <w:lang w:val="en-US" w:eastAsia="en-US" w:bidi="ar-SA"/>
               </w:rPr>
-              <w:t>020</w:t>
+              <w:t>019</w:t>
             </w:r>
           </w:p>
         </w:tc>
@@ -20900,7 +21021,7 @@
                 <w:szCs w:val="22"/>
                 <w:lang w:val="en-US" w:eastAsia="en-US" w:bidi="ar-SA"/>
               </w:rPr>
-              <w:t>1,791</w:t>
+              <w:t>2,812</w:t>
             </w:r>
           </w:p>
         </w:tc>
@@ -20932,7 +21053,7 @@
                 <w:szCs w:val="22"/>
                 <w:lang w:val="en-US" w:eastAsia="en-US" w:bidi="ar-SA"/>
               </w:rPr>
-              <w:t>2,168</w:t>
+              <w:t>2,101</w:t>
             </w:r>
           </w:p>
         </w:tc>
@@ -20964,7 +21085,7 @@
                 <w:szCs w:val="22"/>
                 <w:lang w:val="en-US" w:eastAsia="en-US" w:bidi="ar-SA"/>
               </w:rPr>
-              <w:t>358,4</w:t>
+              <w:t>355,1</w:t>
             </w:r>
           </w:p>
         </w:tc>
@@ -20996,7 +21117,7 @@
                 <w:szCs w:val="22"/>
                 <w:lang w:val="en-US" w:eastAsia="en-US" w:bidi="ar-SA"/>
               </w:rPr>
-              <w:t>0,134</w:t>
+              <w:t>0,192</w:t>
             </w:r>
           </w:p>
         </w:tc>
@@ -21065,7 +21186,7 @@
                 <w:szCs w:val="22"/>
                 <w:lang w:val="en-US" w:eastAsia="en-US" w:bidi="ar-SA"/>
               </w:rPr>
-              <w:t>021</w:t>
+              <w:t>020</w:t>
             </w:r>
           </w:p>
         </w:tc>
@@ -21097,7 +21218,7 @@
                 <w:szCs w:val="22"/>
                 <w:lang w:val="en-US" w:eastAsia="en-US" w:bidi="ar-SA"/>
               </w:rPr>
-              <w:t>1,100</w:t>
+              <w:t>1,952</w:t>
             </w:r>
           </w:p>
         </w:tc>
@@ -21129,7 +21250,7 @@
                 <w:szCs w:val="22"/>
                 <w:lang w:val="en-US" w:eastAsia="en-US" w:bidi="ar-SA"/>
               </w:rPr>
-              <w:t>2,896</w:t>
+              <w:t>1,859</w:t>
             </w:r>
           </w:p>
         </w:tc>
@@ -21161,7 +21282,7 @@
                 <w:szCs w:val="22"/>
                 <w:lang w:val="en-US" w:eastAsia="en-US" w:bidi="ar-SA"/>
               </w:rPr>
-              <w:t>394,8</w:t>
+              <w:t>343,0</w:t>
             </w:r>
           </w:p>
         </w:tc>
@@ -21193,7 +21314,7 @@
                 <w:szCs w:val="22"/>
                 <w:lang w:val="en-US" w:eastAsia="en-US" w:bidi="ar-SA"/>
               </w:rPr>
-              <w:t>0,224</w:t>
+              <w:t>0,132</w:t>
             </w:r>
           </w:p>
         </w:tc>
@@ -21262,7 +21383,7 @@
                 <w:szCs w:val="22"/>
                 <w:lang w:val="en-US" w:eastAsia="en-US" w:bidi="ar-SA"/>
               </w:rPr>
-              <w:t>022</w:t>
+              <w:t>021</w:t>
             </w:r>
           </w:p>
         </w:tc>
@@ -21294,7 +21415,7 @@
                 <w:szCs w:val="22"/>
                 <w:lang w:val="en-US" w:eastAsia="en-US" w:bidi="ar-SA"/>
               </w:rPr>
-              <w:t>1,768</w:t>
+              <w:t>1,246</w:t>
             </w:r>
           </w:p>
         </w:tc>
@@ -21326,7 +21447,7 @@
                 <w:szCs w:val="22"/>
                 <w:lang w:val="en-US" w:eastAsia="en-US" w:bidi="ar-SA"/>
               </w:rPr>
-              <w:t>2,468</w:t>
+              <w:t>2,517</w:t>
             </w:r>
           </w:p>
         </w:tc>
@@ -21358,7 +21479,7 @@
                 <w:szCs w:val="22"/>
                 <w:lang w:val="en-US" w:eastAsia="en-US" w:bidi="ar-SA"/>
               </w:rPr>
-              <w:t>373,4</w:t>
+              <w:t>375,9</w:t>
             </w:r>
           </w:p>
         </w:tc>
@@ -21390,7 +21511,7 @@
                 <w:szCs w:val="22"/>
                 <w:lang w:val="en-US" w:eastAsia="en-US" w:bidi="ar-SA"/>
               </w:rPr>
-              <w:t>0,159</w:t>
+              <w:t>0,227</w:t>
             </w:r>
           </w:p>
         </w:tc>
@@ -21459,7 +21580,7 @@
                 <w:szCs w:val="22"/>
                 <w:lang w:val="en-US" w:eastAsia="en-US" w:bidi="ar-SA"/>
               </w:rPr>
-              <w:t>023</w:t>
+              <w:t>022</w:t>
             </w:r>
           </w:p>
         </w:tc>
@@ -21491,7 +21612,7 @@
                 <w:szCs w:val="22"/>
                 <w:lang w:val="en-US" w:eastAsia="en-US" w:bidi="ar-SA"/>
               </w:rPr>
-              <w:t>1,554</w:t>
+              <w:t>1,981</w:t>
             </w:r>
           </w:p>
         </w:tc>
@@ -21523,7 +21644,7 @@
                 <w:szCs w:val="22"/>
                 <w:lang w:val="en-US" w:eastAsia="en-US" w:bidi="ar-SA"/>
               </w:rPr>
-              <w:t>2,499</w:t>
+              <w:t>2,151</w:t>
             </w:r>
           </w:p>
         </w:tc>
@@ -21555,7 +21676,7 @@
                 <w:szCs w:val="22"/>
                 <w:lang w:val="en-US" w:eastAsia="en-US" w:bidi="ar-SA"/>
               </w:rPr>
-              <w:t>374,9</w:t>
+              <w:t>357,6</w:t>
             </w:r>
           </w:p>
         </w:tc>
@@ -21587,7 +21708,7 @@
                 <w:szCs w:val="22"/>
                 <w:lang w:val="en-US" w:eastAsia="en-US" w:bidi="ar-SA"/>
               </w:rPr>
-              <w:t>0,151</w:t>
+              <w:t>0,162</w:t>
             </w:r>
           </w:p>
         </w:tc>
@@ -21656,7 +21777,7 @@
                 <w:szCs w:val="22"/>
                 <w:lang w:val="en-US" w:eastAsia="en-US" w:bidi="ar-SA"/>
               </w:rPr>
-              <w:t>024</w:t>
+              <w:t>023</w:t>
             </w:r>
           </w:p>
         </w:tc>
@@ -21688,7 +21809,7 @@
                 <w:szCs w:val="22"/>
                 <w:lang w:val="en-US" w:eastAsia="en-US" w:bidi="ar-SA"/>
               </w:rPr>
-              <w:t>0,269</w:t>
+              <w:t>1,731</w:t>
             </w:r>
           </w:p>
         </w:tc>
@@ -21720,7 +21841,7 @@
                 <w:szCs w:val="22"/>
                 <w:lang w:val="en-US" w:eastAsia="en-US" w:bidi="ar-SA"/>
               </w:rPr>
-              <w:t>4,127</w:t>
+              <w:t>2,175</w:t>
             </w:r>
           </w:p>
         </w:tc>
@@ -21752,7 +21873,7 @@
                 <w:szCs w:val="22"/>
                 <w:lang w:val="en-US" w:eastAsia="en-US" w:bidi="ar-SA"/>
               </w:rPr>
-              <w:t>456,4</w:t>
+              <w:t>358,8</w:t>
             </w:r>
           </w:p>
         </w:tc>
@@ -21784,7 +21905,7 @@
                 <w:szCs w:val="22"/>
                 <w:lang w:val="en-US" w:eastAsia="en-US" w:bidi="ar-SA"/>
               </w:rPr>
-              <w:t>0,044</w:t>
+              <w:t>0,154</w:t>
             </w:r>
           </w:p>
         </w:tc>
@@ -21853,7 +21974,7 @@
                 <w:szCs w:val="22"/>
                 <w:lang w:val="en-US" w:eastAsia="en-US" w:bidi="ar-SA"/>
               </w:rPr>
-              <w:t>025</w:t>
+              <w:t>024</w:t>
             </w:r>
           </w:p>
         </w:tc>
@@ -21885,7 +22006,7 @@
                 <w:szCs w:val="22"/>
                 <w:lang w:val="en-US" w:eastAsia="en-US" w:bidi="ar-SA"/>
               </w:rPr>
-              <w:t>2,850</w:t>
+              <w:t>0,300</w:t>
             </w:r>
           </w:p>
         </w:tc>
@@ -21917,7 +22038,7 @@
                 <w:szCs w:val="22"/>
                 <w:lang w:val="en-US" w:eastAsia="en-US" w:bidi="ar-SA"/>
               </w:rPr>
-              <w:t>2,358</w:t>
+              <w:t>3,600</w:t>
             </w:r>
           </w:p>
         </w:tc>
@@ -21949,7 +22070,7 @@
                 <w:szCs w:val="22"/>
                 <w:lang w:val="en-US" w:eastAsia="en-US" w:bidi="ar-SA"/>
               </w:rPr>
-              <w:t>367,9</w:t>
+              <w:t>430,0</w:t>
             </w:r>
           </w:p>
         </w:tc>
@@ -21981,7 +22102,7 @@
                 <w:szCs w:val="22"/>
                 <w:lang w:val="en-US" w:eastAsia="en-US" w:bidi="ar-SA"/>
               </w:rPr>
-              <w:t>0,156</w:t>
+              <w:t>0,044</w:t>
             </w:r>
           </w:p>
         </w:tc>
@@ -22013,7 +22134,7 @@
                 <w:szCs w:val="22"/>
                 <w:lang w:val="en-US" w:eastAsia="en-US" w:bidi="ar-SA"/>
               </w:rPr>
-              <w:t>Sim</w:t>
+              <w:t>Não</w:t>
             </w:r>
           </w:p>
         </w:tc>
@@ -22050,6 +22171,203 @@
                 <w:szCs w:val="22"/>
                 <w:lang w:val="en-US" w:eastAsia="en-US" w:bidi="ar-SA"/>
               </w:rPr>
+              <w:t>025</w:t>
+            </w:r>
+          </w:p>
+        </w:tc>
+        <w:tc>
+          <w:tcPr>
+            <w:tcW w:w="1299" w:type="dxa"/>
+            <w:tcBorders/>
+            <w:vAlign w:val="center"/>
+          </w:tcPr>
+          <w:p>
+            <w:pPr>
+              <w:pStyle w:val="Normal"/>
+              <w:widowControl/>
+              <w:spacing w:before="0" w:after="0"/>
+              <w:jc w:val="center"/>
+              <w:rPr>
+                <w:rFonts w:eastAsia="ＭＳ 明朝" w:cs=""/>
+                <w:kern w:val="0"/>
+                <w:szCs w:val="22"/>
+                <w:lang w:val="en-US" w:eastAsia="en-US" w:bidi="ar-SA"/>
+              </w:rPr>
+            </w:pPr>
+            <w:r>
+              <w:rPr>
+                <w:rFonts w:eastAsia="ＭＳ 明朝" w:cs=""/>
+                <w:color w:val="222222"/>
+                <w:kern w:val="0"/>
+                <w:sz w:val="18"/>
+                <w:szCs w:val="22"/>
+                <w:lang w:val="en-US" w:eastAsia="en-US" w:bidi="ar-SA"/>
+              </w:rPr>
+              <w:t>2,850</w:t>
+            </w:r>
+          </w:p>
+        </w:tc>
+        <w:tc>
+          <w:tcPr>
+            <w:tcW w:w="1300" w:type="dxa"/>
+            <w:tcBorders/>
+            <w:vAlign w:val="center"/>
+          </w:tcPr>
+          <w:p>
+            <w:pPr>
+              <w:pStyle w:val="Normal"/>
+              <w:widowControl/>
+              <w:spacing w:before="0" w:after="0"/>
+              <w:jc w:val="center"/>
+              <w:rPr>
+                <w:rFonts w:eastAsia="ＭＳ 明朝" w:cs=""/>
+                <w:kern w:val="0"/>
+                <w:szCs w:val="22"/>
+                <w:lang w:val="en-US" w:eastAsia="en-US" w:bidi="ar-SA"/>
+              </w:rPr>
+            </w:pPr>
+            <w:r>
+              <w:rPr>
+                <w:rFonts w:eastAsia="ＭＳ 明朝" w:cs=""/>
+                <w:color w:val="222222"/>
+                <w:kern w:val="0"/>
+                <w:sz w:val="18"/>
+                <w:szCs w:val="22"/>
+                <w:lang w:val="en-US" w:eastAsia="en-US" w:bidi="ar-SA"/>
+              </w:rPr>
+              <w:t>2,358</w:t>
+            </w:r>
+          </w:p>
+        </w:tc>
+        <w:tc>
+          <w:tcPr>
+            <w:tcW w:w="2500" w:type="dxa"/>
+            <w:tcBorders/>
+            <w:vAlign w:val="center"/>
+          </w:tcPr>
+          <w:p>
+            <w:pPr>
+              <w:pStyle w:val="Normal"/>
+              <w:widowControl/>
+              <w:spacing w:before="0" w:after="0"/>
+              <w:jc w:val="center"/>
+              <w:rPr>
+                <w:rFonts w:eastAsia="ＭＳ 明朝" w:cs=""/>
+                <w:kern w:val="0"/>
+                <w:szCs w:val="22"/>
+                <w:lang w:val="en-US" w:eastAsia="en-US" w:bidi="ar-SA"/>
+              </w:rPr>
+            </w:pPr>
+            <w:r>
+              <w:rPr>
+                <w:rFonts w:eastAsia="ＭＳ 明朝" w:cs=""/>
+                <w:color w:val="222222"/>
+                <w:kern w:val="0"/>
+                <w:sz w:val="18"/>
+                <w:szCs w:val="22"/>
+                <w:lang w:val="en-US" w:eastAsia="en-US" w:bidi="ar-SA"/>
+              </w:rPr>
+              <w:t>367,9</w:t>
+            </w:r>
+          </w:p>
+        </w:tc>
+        <w:tc>
+          <w:tcPr>
+            <w:tcW w:w="1401" w:type="dxa"/>
+            <w:tcBorders/>
+            <w:vAlign w:val="center"/>
+          </w:tcPr>
+          <w:p>
+            <w:pPr>
+              <w:pStyle w:val="Normal"/>
+              <w:widowControl/>
+              <w:spacing w:before="0" w:after="0"/>
+              <w:jc w:val="center"/>
+              <w:rPr>
+                <w:rFonts w:eastAsia="ＭＳ 明朝" w:cs=""/>
+                <w:kern w:val="0"/>
+                <w:szCs w:val="22"/>
+                <w:lang w:val="en-US" w:eastAsia="en-US" w:bidi="ar-SA"/>
+              </w:rPr>
+            </w:pPr>
+            <w:r>
+              <w:rPr>
+                <w:rFonts w:eastAsia="ＭＳ 明朝" w:cs=""/>
+                <w:color w:val="222222"/>
+                <w:kern w:val="0"/>
+                <w:sz w:val="18"/>
+                <w:szCs w:val="22"/>
+                <w:lang w:val="en-US" w:eastAsia="en-US" w:bidi="ar-SA"/>
+              </w:rPr>
+              <w:t>0,156</w:t>
+            </w:r>
+          </w:p>
+        </w:tc>
+        <w:tc>
+          <w:tcPr>
+            <w:tcW w:w="1959" w:type="dxa"/>
+            <w:tcBorders/>
+            <w:vAlign w:val="center"/>
+          </w:tcPr>
+          <w:p>
+            <w:pPr>
+              <w:pStyle w:val="Normal"/>
+              <w:widowControl/>
+              <w:spacing w:before="0" w:after="0"/>
+              <w:jc w:val="center"/>
+              <w:rPr>
+                <w:rFonts w:eastAsia="ＭＳ 明朝" w:cs=""/>
+                <w:kern w:val="0"/>
+                <w:szCs w:val="22"/>
+                <w:lang w:val="en-US" w:eastAsia="en-US" w:bidi="ar-SA"/>
+              </w:rPr>
+            </w:pPr>
+            <w:r>
+              <w:rPr>
+                <w:rFonts w:eastAsia="ＭＳ 明朝" w:cs=""/>
+                <w:color w:val="222222"/>
+                <w:kern w:val="0"/>
+                <w:sz w:val="18"/>
+                <w:szCs w:val="22"/>
+                <w:lang w:val="en-US" w:eastAsia="en-US" w:bidi="ar-SA"/>
+              </w:rPr>
+              <w:t>Sim</w:t>
+            </w:r>
+          </w:p>
+        </w:tc>
+      </w:tr>
+      <w:tr>
+        <w:trPr>
+          <w:cantSplit w:val="true"/>
+        </w:trPr>
+        <w:tc>
+          <w:tcPr>
+            <w:tcW w:w="900" w:type="dxa"/>
+            <w:tcBorders/>
+            <w:vAlign w:val="center"/>
+          </w:tcPr>
+          <w:p>
+            <w:pPr>
+              <w:pStyle w:val="Normal"/>
+              <w:widowControl/>
+              <w:spacing w:before="0" w:after="0"/>
+              <w:jc w:val="center"/>
+              <w:rPr>
+                <w:rFonts w:eastAsia="ＭＳ 明朝" w:cs=""/>
+                <w:kern w:val="0"/>
+                <w:szCs w:val="22"/>
+                <w:lang w:val="en-US" w:eastAsia="en-US" w:bidi="ar-SA"/>
+              </w:rPr>
+            </w:pPr>
+            <w:r>
+              <w:rPr>
+                <w:rFonts w:eastAsia="ＭＳ 明朝" w:cs=""/>
+                <w:color w:val="222222"/>
+                <w:kern w:val="0"/>
+                <w:sz w:val="18"/>
+                <w:szCs w:val="22"/>
+                <w:lang w:val="en-US" w:eastAsia="en-US" w:bidi="ar-SA"/>
+              </w:rPr>
               <w:t>026</w:t>
             </w:r>
           </w:p>
@@ -22082,7 +22400,7 @@
                 <w:szCs w:val="22"/>
                 <w:lang w:val="en-US" w:eastAsia="en-US" w:bidi="ar-SA"/>
               </w:rPr>
-              <w:t>1,405</w:t>
+              <w:t>1,534</w:t>
             </w:r>
           </w:p>
         </w:tc>
@@ -22114,7 +22432,7 @@
                 <w:szCs w:val="22"/>
                 <w:lang w:val="en-US" w:eastAsia="en-US" w:bidi="ar-SA"/>
               </w:rPr>
-              <w:t>2,514</w:t>
+              <w:t>2,181</w:t>
             </w:r>
           </w:p>
         </w:tc>
@@ -22146,7 +22464,7 @@
                 <w:szCs w:val="22"/>
                 <w:lang w:val="en-US" w:eastAsia="en-US" w:bidi="ar-SA"/>
               </w:rPr>
-              <w:t>375,7</w:t>
+              <w:t>359,1</w:t>
             </w:r>
           </w:p>
         </w:tc>
@@ -28701,7 +29019,7 @@
                 <w:szCs w:val="22"/>
                 <w:lang w:val="en-US" w:eastAsia="en-US" w:bidi="ar-SA"/>
               </w:rPr>
-              <w:t>449</w:t>
+              <w:t>1.084</w:t>
             </w:r>
           </w:p>
         </w:tc>
@@ -28733,7 +29051,7 @@
                 <w:szCs w:val="22"/>
                 <w:lang w:val="en-US" w:eastAsia="en-US" w:bidi="ar-SA"/>
               </w:rPr>
-              <w:t>1,580%</w:t>
+              <w:t>3,815%</w:t>
             </w:r>
           </w:p>
         </w:tc>
@@ -28866,7 +29184,7 @@
                 <w:szCs w:val="22"/>
                 <w:lang w:val="en-US" w:eastAsia="en-US" w:bidi="ar-SA"/>
               </w:rPr>
-              <w:t>4.398</w:t>
+              <w:t>4.308</w:t>
             </w:r>
           </w:p>
         </w:tc>
@@ -28898,7 +29216,7 @@
                 <w:szCs w:val="22"/>
                 <w:lang w:val="en-US" w:eastAsia="en-US" w:bidi="ar-SA"/>
               </w:rPr>
-              <w:t>15,477%</w:t>
+              <w:t>15,160%</w:t>
             </w:r>
           </w:p>
         </w:tc>
@@ -29031,7 +29349,7 @@
                 <w:szCs w:val="22"/>
                 <w:lang w:val="en-US" w:eastAsia="en-US" w:bidi="ar-SA"/>
               </w:rPr>
-              <w:t>5.028</w:t>
+              <w:t>5.671</w:t>
             </w:r>
           </w:p>
         </w:tc>
@@ -29063,7 +29381,7 @@
                 <w:szCs w:val="22"/>
                 <w:lang w:val="en-US" w:eastAsia="en-US" w:bidi="ar-SA"/>
               </w:rPr>
-              <w:t>17,694%</w:t>
+              <w:t>19,957%</w:t>
             </w:r>
           </w:p>
         </w:tc>
@@ -29196,7 +29514,7 @@
                 <w:szCs w:val="22"/>
                 <w:lang w:val="en-US" w:eastAsia="en-US" w:bidi="ar-SA"/>
               </w:rPr>
-              <w:t>4.636</w:t>
+              <w:t>4.806</w:t>
             </w:r>
           </w:p>
         </w:tc>
@@ -29228,7 +29546,7 @@
                 <w:szCs w:val="22"/>
                 <w:lang w:val="en-US" w:eastAsia="en-US" w:bidi="ar-SA"/>
               </w:rPr>
-              <w:t>16,315%</w:t>
+              <w:t>16,913%</w:t>
             </w:r>
           </w:p>
         </w:tc>
@@ -29361,7 +29679,7 @@
                 <w:szCs w:val="22"/>
                 <w:lang w:val="en-US" w:eastAsia="en-US" w:bidi="ar-SA"/>
               </w:rPr>
-              <w:t>3.570</w:t>
+              <w:t>3.371</w:t>
             </w:r>
           </w:p>
         </w:tc>
@@ -29393,7 +29711,7 @@
                 <w:szCs w:val="22"/>
                 <w:lang w:val="en-US" w:eastAsia="en-US" w:bidi="ar-SA"/>
               </w:rPr>
-              <w:t>12,563%</w:t>
+              <w:t>11,863%</w:t>
             </w:r>
           </w:p>
         </w:tc>
@@ -29526,7 +29844,7 @@
                 <w:szCs w:val="22"/>
                 <w:lang w:val="en-US" w:eastAsia="en-US" w:bidi="ar-SA"/>
               </w:rPr>
-              <w:t>2.349</w:t>
+              <w:t>2.199</w:t>
             </w:r>
           </w:p>
         </w:tc>
@@ -29558,7 +29876,7 @@
                 <w:szCs w:val="22"/>
                 <w:lang w:val="en-US" w:eastAsia="en-US" w:bidi="ar-SA"/>
               </w:rPr>
-              <w:t>8,266%</w:t>
+              <w:t>7,739%</w:t>
             </w:r>
           </w:p>
         </w:tc>
@@ -29691,7 +30009,7 @@
                 <w:szCs w:val="22"/>
                 <w:lang w:val="en-US" w:eastAsia="en-US" w:bidi="ar-SA"/>
               </w:rPr>
-              <w:t>1.811</w:t>
+              <w:t>1.957</w:t>
             </w:r>
           </w:p>
         </w:tc>
@@ -29723,7 +30041,7 @@
                 <w:szCs w:val="22"/>
                 <w:lang w:val="en-US" w:eastAsia="en-US" w:bidi="ar-SA"/>
               </w:rPr>
-              <w:t>6,373%</w:t>
+              <w:t>6,887%</w:t>
             </w:r>
           </w:p>
         </w:tc>
@@ -29856,7 +30174,7 @@
                 <w:szCs w:val="22"/>
                 <w:lang w:val="en-US" w:eastAsia="en-US" w:bidi="ar-SA"/>
               </w:rPr>
-              <w:t>6.175</w:t>
+              <w:t>5.020</w:t>
             </w:r>
           </w:p>
         </w:tc>
@@ -29888,7 +30206,7 @@
                 <w:szCs w:val="22"/>
                 <w:lang w:val="en-US" w:eastAsia="en-US" w:bidi="ar-SA"/>
               </w:rPr>
-              <w:t>21,731%</w:t>
+              <w:t>17,666%</w:t>
             </w:r>
           </w:p>
         </w:tc>
@@ -30034,7 +30352,7 @@
     </w:r>
     <w:r>
       <w:rPr/>
-      <w:t>8</w:t>
+      <w:t>14</w:t>
     </w:r>
     <w:r>
       <w:rPr/>
@@ -30073,7 +30391,7 @@
     </w:r>
     <w:r>
       <w:rPr/>
-      <w:t>8</w:t>
+      <w:t>14</w:t>
     </w:r>
     <w:r>
       <w:rPr/>

</xml_diff>